<commit_message>
Fix ambiguous /shop/[slug] links, add domain/email notes to Sanity guide
Some artworks are sold as both an Original and a Print, so their product
docs share one artwork slug. /shop/[slug].vue picked whichever product
Sanity returned first with no filter or order, so the same URL from the
Originals grid vs. the Prints grid would inconsistently show either one.

Product page now fetches all products for the slug and resolves via a
?type= query param (falling back to a fixed original>print>calendar>
card>gift priority when absent). Updated every /shop/<slug> link
(originals, prints, gifts, homepage featured work, cart) to pass the
type it means.

Also added Domain Names and Email reference sections to
ROBERT_SANITY_GUIDE.md/.docx (robertduncanfineart.com on Squarespace
Domains, robertduncan.art on GoDaddy, Google Workspace mailboxes).

Co-Authored-By: Claude Sonnet 5 <noreply@anthropic.com>
</commit_message>
<xml_diff>
--- a/ROBERT_SANITY_GUIDE.docx
+++ b/ROBERT_SANITY_GUIDE.docx
@@ -2,7 +2,7 @@
 <file path=word/document.xml><?xml version="1.0" encoding="utf-8"?>
 <w:document xmlns:w="http://schemas.openxmlformats.org/wordprocessingml/2006/main" xmlns:m="http://schemas.openxmlformats.org/officeDocument/2006/math" xmlns:r="http://schemas.openxmlformats.org/officeDocument/2006/relationships" xmlns:o="urn:schemas-microsoft-com:office:office" xmlns:v="urn:schemas-microsoft-com:vml" xmlns:w10="urn:schemas-microsoft-com:office:word" xmlns:a="http://schemas.openxmlformats.org/drawingml/2006/main" xmlns:pic="http://schemas.openxmlformats.org/drawingml/2006/picture" xmlns:wp="http://schemas.openxmlformats.org/drawingml/2006/wordprocessingDrawing">
   <w:body>
-    <w:bookmarkStart w:id="22" w:name="Xbd9b0307e950a6b0de075bd127d9c21764d265d"/>
+    <w:bookmarkStart w:id="23" w:name="Xa87b9e46c6f32ab31d251a226197b3086a6b95d"/>
     <w:p>
       <w:pPr>
         <w:pStyle w:val="Heading1"/>
@@ -39,21 +39,16 @@
       <w:r>
         <w:t xml:space="preserve"> </w:t>
       </w:r>
-      <w:hyperlink r:id="rId9">
-        <w:r>
-          <w:rPr>
-            <w:rStyle w:val="Hyperlink"/>
-          </w:rPr>
-          <w:t xml:space="preserve">https://robert-duncan-fine-art.sanity.studio/</w:t>
-        </w:r>
-      </w:hyperlink>
+      <w:r>
+        <w:t xml:space="preserve">https://robert-duncan-fine-art.sanity.studio/</w:t>
+      </w:r>
     </w:p>
     <w:p>
       <w:pPr>
         <w:pStyle w:val="BodyText"/>
       </w:pPr>
       <w:r>
-        <w:t xml:space="preserve">Sign in with your own account. If you don't have login access yet, ask Josh to invite</w:t>
+        <w:t xml:space="preserve">Sign in with your own account. If you don’t have login access yet, ask Josh to invite</w:t>
       </w:r>
       <w:r>
         <w:t xml:space="preserve"> </w:t>
@@ -69,7 +64,7 @@
         </w:pict>
       </w:r>
     </w:p>
-    <w:bookmarkStart w:id="10" w:name="the-big-idea-read-this-first"/>
+    <w:bookmarkStart w:id="9" w:name="the-big-idea-read-this-first"/>
     <w:p>
       <w:pPr>
         <w:pStyle w:val="Heading2"/>
@@ -143,7 +138,7 @@
         <w:t xml:space="preserve"> </w:t>
       </w:r>
       <w:r>
-        <w:t xml:space="preserve">— how it's</w:t>
+        <w:t xml:space="preserve">— how it’s</w:t>
       </w:r>
       <w:r>
         <w:t xml:space="preserve"> </w:t>
@@ -156,7 +151,7 @@
         <w:t xml:space="preserve">sold</w:t>
       </w:r>
       <w:r>
-        <w:t xml:space="preserve">: is it an Original? A Print? A calendar? What's the price?</w:t>
+        <w:t xml:space="preserve">: is it an Original? A Print? A calendar? What’s the price?</w:t>
       </w:r>
     </w:p>
     <w:p>
@@ -186,7 +181,25 @@
         <w:t xml:space="preserve"> </w:t>
       </w:r>
       <w:r>
-        <w:t xml:space="preserve">as the "who is this painting" and the Product as the "how do people buy it."</w:t>
+        <w:t xml:space="preserve">as the</w:t>
+      </w:r>
+      <w:r>
+        <w:t xml:space="preserve"> </w:t>
+      </w:r>
+      <w:r>
+        <w:t xml:space="preserve">“who is this painting”</w:t>
+      </w:r>
+      <w:r>
+        <w:t xml:space="preserve"> </w:t>
+      </w:r>
+      <w:r>
+        <w:t xml:space="preserve">and the Product as the</w:t>
+      </w:r>
+      <w:r>
+        <w:t xml:space="preserve"> </w:t>
+      </w:r>
+      <w:r>
+        <w:t xml:space="preserve">“how do people buy it.”</w:t>
       </w:r>
     </w:p>
     <w:p>
@@ -216,7 +229,7 @@
         <w:t xml:space="preserve"> </w:t>
       </w:r>
       <w:r>
-        <w:t xml:space="preserve">— every painting's photos and details</w:t>
+        <w:t xml:space="preserve">— every painting’s photos and details</w:t>
       </w:r>
     </w:p>
     <w:p>
@@ -304,7 +317,7 @@
         <w:t xml:space="preserve"> </w:t>
       </w:r>
       <w:r>
-        <w:t xml:space="preserve">of the site that aren't tied to one specific painting</w:t>
+        <w:t xml:space="preserve">of the site that aren’t tied to one specific painting</w:t>
       </w:r>
     </w:p>
     <w:p>
@@ -342,8 +355,8 @@
         </w:pict>
       </w:r>
     </w:p>
-    <w:bookmarkEnd w:id="10"/>
-    <w:bookmarkStart w:id="13" w:name="adding-a-new-original-painting"/>
+    <w:bookmarkEnd w:id="9"/>
+    <w:bookmarkStart w:id="12" w:name="adding-a-new-original-painting"/>
     <w:p>
       <w:pPr>
         <w:pStyle w:val="Heading2"/>
@@ -352,7 +365,7 @@
         <w:t xml:space="preserve">Adding a New Original Painting</w:t>
       </w:r>
     </w:p>
-    <w:bookmarkStart w:id="11" w:name="step-1--create-the-artwork"/>
+    <w:bookmarkStart w:id="10" w:name="step-1-create-the-artwork"/>
     <w:p>
       <w:pPr>
         <w:pStyle w:val="Heading3"/>
@@ -480,13 +493,13 @@
         <w:t xml:space="preserve"> </w:t>
       </w:r>
       <w:r>
-        <w:t xml:space="preserve">— this becomes part of the page's web address. It fills in</w:t>
-      </w:r>
-      <w:r>
-        <w:t xml:space="preserve"> </w:t>
-      </w:r>
-      <w:r>
-        <w:t xml:space="preserve">automatically from the Title; you usually don't need to touch it.</w:t>
+        <w:t xml:space="preserve">— this becomes part of the page’s web address. It fills in</w:t>
+      </w:r>
+      <w:r>
+        <w:t xml:space="preserve"> </w:t>
+      </w:r>
+      <w:r>
+        <w:t xml:space="preserve">automatically from the Title; you usually don’t need to touch it.</w:t>
       </w:r>
     </w:p>
     <w:p>
@@ -508,7 +521,10 @@
         <w:t xml:space="preserve"> </w:t>
       </w:r>
       <w:r>
-        <w:t xml:space="preserve">— e.g. "Oil on canvas"</w:t>
+        <w:t xml:space="preserve">— e.g. </w:t>
+      </w:r>
+      <w:r>
+        <w:t xml:space="preserve">“Oil on canvas”</w:t>
       </w:r>
     </w:p>
     <w:p>
@@ -530,10 +546,7 @@
         <w:t xml:space="preserve"> </w:t>
       </w:r>
       <w:r>
-        <w:t xml:space="preserve">— e.g.</w:t>
-      </w:r>
-      <w:r>
-        <w:t xml:space="preserve"> </w:t>
+        <w:t xml:space="preserve">— e.g. </w:t>
       </w:r>
       <w:r>
         <w:rPr>
@@ -599,7 +612,19 @@
         <w:t xml:space="preserve"> </w:t>
       </w:r>
       <w:r>
-        <w:t xml:space="preserve">— turn this on if you want a "New Work" badge to show on the piece</w:t>
+        <w:t xml:space="preserve">— turn this on if you want a</w:t>
+      </w:r>
+      <w:r>
+        <w:t xml:space="preserve"> </w:t>
+      </w:r>
+      <w:r>
+        <w:t xml:space="preserve">“New Work”</w:t>
+      </w:r>
+      <w:r>
+        <w:t xml:space="preserve"> </w:t>
+      </w:r>
+      <w:r>
+        <w:t xml:space="preserve">badge to show on the piece</w:t>
       </w:r>
     </w:p>
     <w:p>
@@ -665,7 +690,7 @@
         <w:t xml:space="preserve"> </w:t>
       </w:r>
       <w:r>
-        <w:t xml:space="preserve">— the longer write-up shown on the painting's page</w:t>
+        <w:t xml:space="preserve">— the longer write-up shown on the painting’s page</w:t>
       </w:r>
     </w:p>
     <w:p>
@@ -718,8 +743,8 @@
         <w:t xml:space="preserve">(top right). Nothing goes live until you click this.</w:t>
       </w:r>
     </w:p>
-    <w:bookmarkEnd w:id="11"/>
-    <w:bookmarkStart w:id="12" w:name="X3c7a535fc51c0ceb4a4f85c257e5a62f20226d3"/>
+    <w:bookmarkEnd w:id="10"/>
+    <w:bookmarkStart w:id="11" w:name="Xfea5eb7f839a42bd585ccebe95b293cd825f41a"/>
     <w:p>
       <w:pPr>
         <w:pStyle w:val="Heading3"/>
@@ -921,13 +946,19 @@
         <w:t xml:space="preserve"> </w:t>
       </w:r>
       <w:r>
-        <w:t xml:space="preserve">with a short note (e.g. "On</w:t>
-      </w:r>
-      <w:r>
-        <w:t xml:space="preserve"> </w:t>
-      </w:r>
-      <w:r>
-        <w:t xml:space="preserve">display at the Smith Gallery, Carmel — contact them to purchase"), which is shown</w:t>
+        <w:t xml:space="preserve">with a short note (e.g. </w:t>
+      </w:r>
+      <w:r>
+        <w:t xml:space="preserve">“On</w:t>
+      </w:r>
+      <w:r>
+        <w:t xml:space="preserve"> </w:t>
+      </w:r>
+      <w:r>
+        <w:t xml:space="preserve">display at the Smith Gallery, Carmel — contact them to purchase”</w:t>
+      </w:r>
+      <w:r>
+        <w:t xml:space="preserve">), which is shown</w:t>
       </w:r>
       <w:r>
         <w:t xml:space="preserve"> </w:t>
@@ -967,7 +998,7 @@
         <w:t xml:space="preserve"> </w:t>
       </w:r>
       <w:r>
-        <w:t xml:space="preserve">cost (e.g. it needs to ship freight/crated).</w:t>
+        <w:t xml:space="preserve">cost (e.g. it needs to ship freight/crated).</w:t>
       </w:r>
     </w:p>
     <w:p>
@@ -1000,7 +1031,7 @@
         <w:pStyle w:val="FirstParagraph"/>
       </w:pPr>
       <w:r>
-        <w:t xml:space="preserve">That's it — the painting will appear on the Originals page.</w:t>
+        <w:t xml:space="preserve">That’s it — the painting will appear on the Originals page.</w:t>
       </w:r>
     </w:p>
     <w:p>
@@ -1010,9 +1041,9 @@
         </w:pict>
       </w:r>
     </w:p>
+    <w:bookmarkEnd w:id="11"/>
     <w:bookmarkEnd w:id="12"/>
-    <w:bookmarkEnd w:id="13"/>
-    <w:bookmarkStart w:id="14" w:name="adding-a-new-calendar-card-or-gift"/>
+    <w:bookmarkStart w:id="13" w:name="adding-a-new-calendar-card-or-gift"/>
     <w:p>
       <w:pPr>
         <w:pStyle w:val="Heading2"/>
@@ -1214,10 +1245,7 @@
         <w:t xml:space="preserve"> </w:t>
       </w:r>
       <w:r>
-        <w:t xml:space="preserve">— the code used for shipping (e.g.</w:t>
-      </w:r>
-      <w:r>
-        <w:t xml:space="preserve"> </w:t>
+        <w:t xml:space="preserve">— the code used for shipping (e.g. </w:t>
       </w:r>
       <w:r>
         <w:rPr>
@@ -1270,13 +1298,19 @@
         <w:t xml:space="preserve"> </w:t>
       </w:r>
       <w:r>
-        <w:t xml:space="preserve">— short details shown on the page (e.g. "12 paintings,</w:t>
-      </w:r>
-      <w:r>
-        <w:t xml:space="preserve"> </w:t>
-      </w:r>
-      <w:r>
-        <w:t xml:space="preserve">12 × 12 in.")</w:t>
+        <w:t xml:space="preserve">— short details shown on the page (e.g. </w:t>
+      </w:r>
+      <w:r>
+        <w:t xml:space="preserve">“12 paintings,</w:t>
+      </w:r>
+      <w:r>
+        <w:t xml:space="preserve"> </w:t>
+      </w:r>
+      <w:r>
+        <w:t xml:space="preserve">12 × 12 in.”</w:t>
+      </w:r>
+      <w:r>
+        <w:t xml:space="preserve">)</w:t>
       </w:r>
     </w:p>
     <w:p>
@@ -1379,8 +1413,8 @@
         </w:pict>
       </w:r>
     </w:p>
-    <w:bookmarkEnd w:id="14"/>
-    <w:bookmarkStart w:id="15" w:name="X82caeab40ca984bf42bbbb0066bab8e2a43e28a"/>
+    <w:bookmarkEnd w:id="13"/>
+    <w:bookmarkStart w:id="14" w:name="X82caeab40ca984bf42bbbb0066bab8e2a43e28a"/>
     <w:p>
       <w:pPr>
         <w:pStyle w:val="Heading2"/>
@@ -1502,8 +1536,8 @@
         </w:pict>
       </w:r>
     </w:p>
-    <w:bookmarkEnd w:id="15"/>
-    <w:bookmarkStart w:id="16" w:name="updating-the-announcement-banner"/>
+    <w:bookmarkEnd w:id="14"/>
+    <w:bookmarkStart w:id="15" w:name="updating-the-announcement-banner"/>
     <w:p>
       <w:pPr>
         <w:pStyle w:val="Heading2"/>
@@ -1517,13 +1551,19 @@
         <w:pStyle w:val="FirstParagraph"/>
       </w:pPr>
       <w:r>
-        <w:t xml:space="preserve">This is the thin colored strip that runs across the top of every page (e.g. "2027</w:t>
-      </w:r>
-      <w:r>
-        <w:t xml:space="preserve"> </w:t>
-      </w:r>
-      <w:r>
-        <w:t xml:space="preserve">Calendars now available").</w:t>
+        <w:t xml:space="preserve">This is the thin colored strip that runs across the top of every page (e.g. </w:t>
+      </w:r>
+      <w:r>
+        <w:t xml:space="preserve">“2027</w:t>
+      </w:r>
+      <w:r>
+        <w:t xml:space="preserve"> </w:t>
+      </w:r>
+      <w:r>
+        <w:t xml:space="preserve">Calendars now available”</w:t>
+      </w:r>
+      <w:r>
+        <w:t xml:space="preserve">).</w:t>
       </w:r>
     </w:p>
     <w:p>
@@ -1683,30 +1723,229 @@
         <w:t xml:space="preserve">.</w:t>
       </w:r>
     </w:p>
+    <w:bookmarkEnd w:id="15"/>
+    <w:bookmarkStart w:id="16" w:name="updating-the-store-banner"/>
+    <w:p>
+      <w:pPr>
+        <w:pStyle w:val="Heading2"/>
+      </w:pPr>
+      <w:r>
+        <w:t xml:space="preserve">Updating the Store Banner</w:t>
+      </w:r>
+    </w:p>
+    <w:p>
+      <w:pPr>
+        <w:pStyle w:val="FirstParagraph"/>
+      </w:pPr>
+      <w:r>
+        <w:t xml:space="preserve">A larger image banner (used in the shop).</w:t>
+      </w:r>
+    </w:p>
+    <w:p>
+      <w:pPr>
+        <w:pStyle w:val="Compact"/>
+        <w:numPr>
+          <w:ilvl w:val="0"/>
+          <w:numId w:val="1010"/>
+        </w:numPr>
+      </w:pPr>
+      <w:r>
+        <w:t xml:space="preserve">Click</w:t>
+      </w:r>
+      <w:r>
+        <w:t xml:space="preserve"> </w:t>
+      </w:r>
+      <w:r>
+        <w:rPr>
+          <w:b/>
+          <w:bCs/>
+        </w:rPr>
+        <w:t xml:space="preserve">Store Banner</w:t>
+      </w:r>
+      <w:r>
+        <w:t xml:space="preserve"> </w:t>
+      </w:r>
+      <w:r>
+        <w:t xml:space="preserve">in the left menu.</w:t>
+      </w:r>
+    </w:p>
+    <w:p>
+      <w:pPr>
+        <w:pStyle w:val="Compact"/>
+        <w:numPr>
+          <w:ilvl w:val="0"/>
+          <w:numId w:val="1010"/>
+        </w:numPr>
+      </w:pPr>
+      <w:r>
+        <w:rPr>
+          <w:b/>
+          <w:bCs/>
+        </w:rPr>
+        <w:t xml:space="preserve">Display Style</w:t>
+      </w:r>
+      <w:r>
+        <w:t xml:space="preserve"> </w:t>
+      </w:r>
+      <w:r>
+        <w:t xml:space="preserve">— a single banner, or a rotating carousel of several.</w:t>
+      </w:r>
+    </w:p>
+    <w:p>
+      <w:pPr>
+        <w:pStyle w:val="Compact"/>
+        <w:numPr>
+          <w:ilvl w:val="0"/>
+          <w:numId w:val="1010"/>
+        </w:numPr>
+      </w:pPr>
+      <w:r>
+        <w:t xml:space="preserve">Under</w:t>
+      </w:r>
+      <w:r>
+        <w:t xml:space="preserve"> </w:t>
+      </w:r>
+      <w:r>
+        <w:rPr>
+          <w:b/>
+          <w:bCs/>
+        </w:rPr>
+        <w:t xml:space="preserve">Banner Items</w:t>
+      </w:r>
+      <w:r>
+        <w:t xml:space="preserve">, click</w:t>
+      </w:r>
+      <w:r>
+        <w:t xml:space="preserve"> </w:t>
+      </w:r>
+      <w:r>
+        <w:rPr>
+          <w:b/>
+          <w:bCs/>
+        </w:rPr>
+        <w:t xml:space="preserve">+</w:t>
+      </w:r>
+      <w:r>
+        <w:t xml:space="preserve"> </w:t>
+      </w:r>
+      <w:r>
+        <w:t xml:space="preserve">to add one: upload an</w:t>
+      </w:r>
+      <w:r>
+        <w:t xml:space="preserve"> </w:t>
+      </w:r>
+      <w:r>
+        <w:rPr>
+          <w:b/>
+          <w:bCs/>
+        </w:rPr>
+        <w:t xml:space="preserve">Image</w:t>
+      </w:r>
+      <w:r>
+        <w:t xml:space="preserve">, optionally</w:t>
+      </w:r>
+      <w:r>
+        <w:t xml:space="preserve"> </w:t>
+      </w:r>
+      <w:r>
+        <w:t xml:space="preserve">add</w:t>
+      </w:r>
+      <w:r>
+        <w:t xml:space="preserve"> </w:t>
+      </w:r>
+      <w:r>
+        <w:rPr>
+          <w:b/>
+          <w:bCs/>
+        </w:rPr>
+        <w:t xml:space="preserve">Text Overlay</w:t>
+      </w:r>
+      <w:r>
+        <w:t xml:space="preserve"> </w:t>
+      </w:r>
+      <w:r>
+        <w:t xml:space="preserve">and a</w:t>
+      </w:r>
+      <w:r>
+        <w:t xml:space="preserve"> </w:t>
+      </w:r>
+      <w:r>
+        <w:rPr>
+          <w:b/>
+          <w:bCs/>
+        </w:rPr>
+        <w:t xml:space="preserve">Link URL</w:t>
+      </w:r>
+      <w:r>
+        <w:t xml:space="preserve"> </w:t>
+      </w:r>
+      <w:r>
+        <w:t xml:space="preserve">(where it goes when clicked), and make</w:t>
+      </w:r>
+      <w:r>
+        <w:t xml:space="preserve"> </w:t>
+      </w:r>
+      <w:r>
+        <w:t xml:space="preserve">sure</w:t>
+      </w:r>
+      <w:r>
+        <w:t xml:space="preserve"> </w:t>
+      </w:r>
+      <w:r>
+        <w:rPr>
+          <w:b/>
+          <w:bCs/>
+        </w:rPr>
+        <w:t xml:space="preserve">Active</w:t>
+      </w:r>
+      <w:r>
+        <w:t xml:space="preserve"> </w:t>
+      </w:r>
+      <w:r>
+        <w:t xml:space="preserve">is turned on.</w:t>
+      </w:r>
+    </w:p>
+    <w:p>
+      <w:pPr>
+        <w:pStyle w:val="Compact"/>
+        <w:numPr>
+          <w:ilvl w:val="0"/>
+          <w:numId w:val="1010"/>
+        </w:numPr>
+      </w:pPr>
+      <w:r>
+        <w:t xml:space="preserve">Click</w:t>
+      </w:r>
+      <w:r>
+        <w:t xml:space="preserve"> </w:t>
+      </w:r>
+      <w:r>
+        <w:rPr>
+          <w:b/>
+          <w:bCs/>
+        </w:rPr>
+        <w:t xml:space="preserve">Publish</w:t>
+      </w:r>
+      <w:r>
+        <w:t xml:space="preserve">.</w:t>
+      </w:r>
+    </w:p>
     <w:bookmarkEnd w:id="16"/>
-    <w:bookmarkStart w:id="17" w:name="updating-the-store-banner"/>
+    <w:bookmarkStart w:id="17" w:name="updating-the-homepage"/>
     <w:p>
       <w:pPr>
         <w:pStyle w:val="Heading2"/>
       </w:pPr>
       <w:r>
-        <w:t xml:space="preserve">Updating the Store Banner</w:t>
-      </w:r>
-    </w:p>
-    <w:p>
-      <w:pPr>
-        <w:pStyle w:val="FirstParagraph"/>
-      </w:pPr>
-      <w:r>
-        <w:t xml:space="preserve">A larger image banner (used in the shop).</w:t>
-      </w:r>
-    </w:p>
-    <w:p>
-      <w:pPr>
-        <w:pStyle w:val="Compact"/>
-        <w:numPr>
-          <w:ilvl w:val="0"/>
-          <w:numId w:val="1010"/>
+        <w:t xml:space="preserve">Updating the Homepage</w:t>
+      </w:r>
+    </w:p>
+    <w:p>
+      <w:pPr>
+        <w:pStyle w:val="Compact"/>
+        <w:numPr>
+          <w:ilvl w:val="0"/>
+          <w:numId w:val="1011"/>
         </w:numPr>
       </w:pPr>
       <w:r>
@@ -1720,7 +1959,7 @@
           <w:b/>
           <w:bCs/>
         </w:rPr>
-        <w:t xml:space="preserve">Store Banner</w:t>
+        <w:t xml:space="preserve">Homepage Settings</w:t>
       </w:r>
       <w:r>
         <w:t xml:space="preserve"> </w:t>
@@ -1734,143 +1973,113 @@
         <w:pStyle w:val="Compact"/>
         <w:numPr>
           <w:ilvl w:val="0"/>
-          <w:numId w:val="1010"/>
-        </w:numPr>
-      </w:pPr>
-      <w:r>
-        <w:rPr>
-          <w:b/>
-          <w:bCs/>
-        </w:rPr>
-        <w:t xml:space="preserve">Display Style</w:t>
-      </w:r>
-      <w:r>
-        <w:t xml:space="preserve"> </w:t>
-      </w:r>
-      <w:r>
-        <w:t xml:space="preserve">— a single banner, or a rotating carousel of several.</w:t>
-      </w:r>
-    </w:p>
-    <w:p>
-      <w:pPr>
-        <w:pStyle w:val="Compact"/>
-        <w:numPr>
-          <w:ilvl w:val="0"/>
-          <w:numId w:val="1010"/>
-        </w:numPr>
-      </w:pPr>
-      <w:r>
-        <w:t xml:space="preserve">Under</w:t>
-      </w:r>
-      <w:r>
-        <w:t xml:space="preserve"> </w:t>
-      </w:r>
-      <w:r>
-        <w:rPr>
-          <w:b/>
-          <w:bCs/>
-        </w:rPr>
-        <w:t xml:space="preserve">Banner Items</w:t>
-      </w:r>
-      <w:r>
-        <w:t xml:space="preserve">, click</w:t>
-      </w:r>
-      <w:r>
-        <w:t xml:space="preserve"> </w:t>
-      </w:r>
-      <w:r>
-        <w:rPr>
-          <w:b/>
-          <w:bCs/>
-        </w:rPr>
-        <w:t xml:space="preserve">+</w:t>
-      </w:r>
-      <w:r>
-        <w:t xml:space="preserve"> </w:t>
-      </w:r>
-      <w:r>
-        <w:t xml:space="preserve">to add one: upload an</w:t>
-      </w:r>
-      <w:r>
-        <w:t xml:space="preserve"> </w:t>
-      </w:r>
-      <w:r>
-        <w:rPr>
-          <w:b/>
-          <w:bCs/>
-        </w:rPr>
-        <w:t xml:space="preserve">Image</w:t>
-      </w:r>
-      <w:r>
-        <w:t xml:space="preserve">, optionally</w:t>
-      </w:r>
-      <w:r>
-        <w:t xml:space="preserve"> </w:t>
-      </w:r>
-      <w:r>
-        <w:t xml:space="preserve">add</w:t>
-      </w:r>
-      <w:r>
-        <w:t xml:space="preserve"> </w:t>
-      </w:r>
-      <w:r>
-        <w:rPr>
-          <w:b/>
-          <w:bCs/>
-        </w:rPr>
-        <w:t xml:space="preserve">Text Overlay</w:t>
-      </w:r>
-      <w:r>
-        <w:t xml:space="preserve"> </w:t>
-      </w:r>
-      <w:r>
-        <w:t xml:space="preserve">and a</w:t>
-      </w:r>
-      <w:r>
-        <w:t xml:space="preserve"> </w:t>
-      </w:r>
-      <w:r>
-        <w:rPr>
-          <w:b/>
-          <w:bCs/>
-        </w:rPr>
-        <w:t xml:space="preserve">Link URL</w:t>
-      </w:r>
-      <w:r>
-        <w:t xml:space="preserve"> </w:t>
-      </w:r>
-      <w:r>
-        <w:t xml:space="preserve">(where it goes when clicked), and make</w:t>
-      </w:r>
-      <w:r>
-        <w:t xml:space="preserve"> </w:t>
-      </w:r>
-      <w:r>
-        <w:t xml:space="preserve">sure</w:t>
-      </w:r>
-      <w:r>
-        <w:t xml:space="preserve"> </w:t>
-      </w:r>
-      <w:r>
-        <w:rPr>
-          <w:b/>
-          <w:bCs/>
-        </w:rPr>
-        <w:t xml:space="preserve">Active</w:t>
-      </w:r>
-      <w:r>
-        <w:t xml:space="preserve"> </w:t>
-      </w:r>
-      <w:r>
-        <w:t xml:space="preserve">is turned on.</w:t>
-      </w:r>
-    </w:p>
-    <w:p>
-      <w:pPr>
-        <w:pStyle w:val="Compact"/>
-        <w:numPr>
-          <w:ilvl w:val="0"/>
-          <w:numId w:val="1010"/>
+          <w:numId w:val="1011"/>
+        </w:numPr>
+      </w:pPr>
+      <w:r>
+        <w:rPr>
+          <w:b/>
+          <w:bCs/>
+        </w:rPr>
+        <w:t xml:space="preserve">Hero Images</w:t>
+      </w:r>
+      <w:r>
+        <w:t xml:space="preserve"> </w:t>
+      </w:r>
+      <w:r>
+        <w:t xml:space="preserve">— the large rotating photos at the very top of the homepage. Drag</w:t>
+      </w:r>
+      <w:r>
+        <w:t xml:space="preserve"> </w:t>
+      </w:r>
+      <w:r>
+        <w:t xml:space="preserve">to reorder.</w:t>
+      </w:r>
+    </w:p>
+    <w:p>
+      <w:pPr>
+        <w:pStyle w:val="Compact"/>
+        <w:numPr>
+          <w:ilvl w:val="0"/>
+          <w:numId w:val="1011"/>
+        </w:numPr>
+      </w:pPr>
+      <w:r>
+        <w:rPr>
+          <w:b/>
+          <w:bCs/>
+        </w:rPr>
+        <w:t xml:space="preserve">Hero Headline</w:t>
+      </w:r>
+      <w:r>
+        <w:t xml:space="preserve"> </w:t>
+      </w:r>
+      <w:r>
+        <w:t xml:space="preserve">— optional text overlaid on the hero image, with a size option.</w:t>
+      </w:r>
+    </w:p>
+    <w:p>
+      <w:pPr>
+        <w:pStyle w:val="Compact"/>
+        <w:numPr>
+          <w:ilvl w:val="0"/>
+          <w:numId w:val="1011"/>
+        </w:numPr>
+      </w:pPr>
+      <w:r>
+        <w:rPr>
+          <w:b/>
+          <w:bCs/>
+        </w:rPr>
+        <w:t xml:space="preserve">Inspiring Quote</w:t>
+      </w:r>
+      <w:r>
+        <w:t xml:space="preserve"> </w:t>
+      </w:r>
+      <w:r>
+        <w:t xml:space="preserve">— an optional quote block shown below the hero (leave blank to</w:t>
+      </w:r>
+      <w:r>
+        <w:t xml:space="preserve"> </w:t>
+      </w:r>
+      <w:r>
+        <w:t xml:space="preserve">hide it entirely). You can set its attribution, font, size, and background color.</w:t>
+      </w:r>
+    </w:p>
+    <w:p>
+      <w:pPr>
+        <w:pStyle w:val="Compact"/>
+        <w:numPr>
+          <w:ilvl w:val="0"/>
+          <w:numId w:val="1011"/>
+        </w:numPr>
+      </w:pPr>
+      <w:r>
+        <w:rPr>
+          <w:b/>
+          <w:bCs/>
+        </w:rPr>
+        <w:t xml:space="preserve">Featured Work</w:t>
+      </w:r>
+      <w:r>
+        <w:t xml:space="preserve"> </w:t>
+      </w:r>
+      <w:r>
+        <w:t xml:space="preserve">— search for and add up to 12 Products (originals, prints,</w:t>
+      </w:r>
+      <w:r>
+        <w:t xml:space="preserve"> </w:t>
+      </w:r>
+      <w:r>
+        <w:t xml:space="preserve">calendars — anything) to spotlight on the homepage. Drag to reorder.</w:t>
+      </w:r>
+    </w:p>
+    <w:p>
+      <w:pPr>
+        <w:pStyle w:val="Compact"/>
+        <w:numPr>
+          <w:ilvl w:val="0"/>
+          <w:numId w:val="1011"/>
         </w:numPr>
       </w:pPr>
       <w:r>
@@ -1891,176 +2100,7 @@
       </w:r>
     </w:p>
     <w:bookmarkEnd w:id="17"/>
-    <w:bookmarkStart w:id="18" w:name="updating-the-homepage"/>
-    <w:p>
-      <w:pPr>
-        <w:pStyle w:val="Heading2"/>
-      </w:pPr>
-      <w:r>
-        <w:t xml:space="preserve">Updating the Homepage</w:t>
-      </w:r>
-    </w:p>
-    <w:p>
-      <w:pPr>
-        <w:pStyle w:val="Compact"/>
-        <w:numPr>
-          <w:ilvl w:val="0"/>
-          <w:numId w:val="1011"/>
-        </w:numPr>
-      </w:pPr>
-      <w:r>
-        <w:t xml:space="preserve">Click</w:t>
-      </w:r>
-      <w:r>
-        <w:t xml:space="preserve"> </w:t>
-      </w:r>
-      <w:r>
-        <w:rPr>
-          <w:b/>
-          <w:bCs/>
-        </w:rPr>
-        <w:t xml:space="preserve">Homepage Settings</w:t>
-      </w:r>
-      <w:r>
-        <w:t xml:space="preserve"> </w:t>
-      </w:r>
-      <w:r>
-        <w:t xml:space="preserve">in the left menu.</w:t>
-      </w:r>
-    </w:p>
-    <w:p>
-      <w:pPr>
-        <w:pStyle w:val="Compact"/>
-        <w:numPr>
-          <w:ilvl w:val="0"/>
-          <w:numId w:val="1011"/>
-        </w:numPr>
-      </w:pPr>
-      <w:r>
-        <w:rPr>
-          <w:b/>
-          <w:bCs/>
-        </w:rPr>
-        <w:t xml:space="preserve">Hero Images</w:t>
-      </w:r>
-      <w:r>
-        <w:t xml:space="preserve"> </w:t>
-      </w:r>
-      <w:r>
-        <w:t xml:space="preserve">— the large rotating photos at the very top of the homepage. Drag</w:t>
-      </w:r>
-      <w:r>
-        <w:t xml:space="preserve"> </w:t>
-      </w:r>
-      <w:r>
-        <w:t xml:space="preserve">to reorder.</w:t>
-      </w:r>
-    </w:p>
-    <w:p>
-      <w:pPr>
-        <w:pStyle w:val="Compact"/>
-        <w:numPr>
-          <w:ilvl w:val="0"/>
-          <w:numId w:val="1011"/>
-        </w:numPr>
-      </w:pPr>
-      <w:r>
-        <w:rPr>
-          <w:b/>
-          <w:bCs/>
-        </w:rPr>
-        <w:t xml:space="preserve">Hero Headline</w:t>
-      </w:r>
-      <w:r>
-        <w:t xml:space="preserve"> </w:t>
-      </w:r>
-      <w:r>
-        <w:t xml:space="preserve">— optional text overlaid on the hero image, with a size option.</w:t>
-      </w:r>
-    </w:p>
-    <w:p>
-      <w:pPr>
-        <w:pStyle w:val="Compact"/>
-        <w:numPr>
-          <w:ilvl w:val="0"/>
-          <w:numId w:val="1011"/>
-        </w:numPr>
-      </w:pPr>
-      <w:r>
-        <w:rPr>
-          <w:b/>
-          <w:bCs/>
-        </w:rPr>
-        <w:t xml:space="preserve">Inspiring Quote</w:t>
-      </w:r>
-      <w:r>
-        <w:t xml:space="preserve"> </w:t>
-      </w:r>
-      <w:r>
-        <w:t xml:space="preserve">— an optional quote block shown below the hero (leave blank to</w:t>
-      </w:r>
-      <w:r>
-        <w:t xml:space="preserve"> </w:t>
-      </w:r>
-      <w:r>
-        <w:t xml:space="preserve">hide it entirely). You can set its attribution, font, size, and background color.</w:t>
-      </w:r>
-    </w:p>
-    <w:p>
-      <w:pPr>
-        <w:pStyle w:val="Compact"/>
-        <w:numPr>
-          <w:ilvl w:val="0"/>
-          <w:numId w:val="1011"/>
-        </w:numPr>
-      </w:pPr>
-      <w:r>
-        <w:rPr>
-          <w:b/>
-          <w:bCs/>
-        </w:rPr>
-        <w:t xml:space="preserve">Featured Work</w:t>
-      </w:r>
-      <w:r>
-        <w:t xml:space="preserve"> </w:t>
-      </w:r>
-      <w:r>
-        <w:t xml:space="preserve">— search for and add up to 12 Products (originals, prints,</w:t>
-      </w:r>
-      <w:r>
-        <w:t xml:space="preserve"> </w:t>
-      </w:r>
-      <w:r>
-        <w:t xml:space="preserve">calendars — anything) to spotlight on the homepage. Drag to reorder.</w:t>
-      </w:r>
-    </w:p>
-    <w:p>
-      <w:pPr>
-        <w:pStyle w:val="Compact"/>
-        <w:numPr>
-          <w:ilvl w:val="0"/>
-          <w:numId w:val="1011"/>
-        </w:numPr>
-      </w:pPr>
-      <w:r>
-        <w:t xml:space="preserve">Click</w:t>
-      </w:r>
-      <w:r>
-        <w:t xml:space="preserve"> </w:t>
-      </w:r>
-      <w:r>
-        <w:rPr>
-          <w:b/>
-          <w:bCs/>
-        </w:rPr>
-        <w:t xml:space="preserve">Publish</w:t>
-      </w:r>
-      <w:r>
-        <w:t xml:space="preserve">.</w:t>
-      </w:r>
-    </w:p>
-    <w:bookmarkEnd w:id="18"/>
-    <w:bookmarkStart w:id="19" w:name="updating-the-about-page--contact-info"/>
+    <w:bookmarkStart w:id="18" w:name="updating-the-about-page-contact-info"/>
     <w:p>
       <w:pPr>
         <w:pStyle w:val="Heading2"/>
@@ -2221,156 +2261,187 @@
         </w:pict>
       </w:r>
     </w:p>
+    <w:bookmarkEnd w:id="18"/>
+    <w:bookmarkStart w:id="19" w:name="a-few-important-habits"/>
+    <w:p>
+      <w:pPr>
+        <w:pStyle w:val="Heading2"/>
+      </w:pPr>
+      <w:r>
+        <w:t xml:space="preserve">A Few Important Habits</w:t>
+      </w:r>
+    </w:p>
+    <w:p>
+      <w:pPr>
+        <w:pStyle w:val="Compact"/>
+        <w:numPr>
+          <w:ilvl w:val="0"/>
+          <w:numId w:val="1013"/>
+        </w:numPr>
+      </w:pPr>
+      <w:r>
+        <w:rPr>
+          <w:b/>
+          <w:bCs/>
+        </w:rPr>
+        <w:t xml:space="preserve">Always click Publish.</w:t>
+      </w:r>
+      <w:r>
+        <w:t xml:space="preserve"> </w:t>
+      </w:r>
+      <w:r>
+        <w:t xml:space="preserve">Nothing goes live on the website until you do — Sanity</w:t>
+      </w:r>
+      <w:r>
+        <w:t xml:space="preserve"> </w:t>
+      </w:r>
+      <w:r>
+        <w:t xml:space="preserve">saves drafts automatically as you type, but a draft alone doesn’t update the site.</w:t>
+      </w:r>
+    </w:p>
+    <w:p>
+      <w:pPr>
+        <w:pStyle w:val="Compact"/>
+        <w:numPr>
+          <w:ilvl w:val="0"/>
+          <w:numId w:val="1013"/>
+        </w:numPr>
+      </w:pPr>
+      <w:r>
+        <w:rPr>
+          <w:b/>
+          <w:bCs/>
+        </w:rPr>
+        <w:t xml:space="preserve">Give it a minute.</w:t>
+      </w:r>
+      <w:r>
+        <w:t xml:space="preserve"> </w:t>
+      </w:r>
+      <w:r>
+        <w:t xml:space="preserve">After publishing, the live site can take a minute or two to</w:t>
+      </w:r>
+      <w:r>
+        <w:t xml:space="preserve"> </w:t>
+      </w:r>
+      <w:r>
+        <w:t xml:space="preserve">show your change (it’s not broken — it’s just catching up).</w:t>
+      </w:r>
+    </w:p>
+    <w:p>
+      <w:pPr>
+        <w:pStyle w:val="Compact"/>
+        <w:numPr>
+          <w:ilvl w:val="0"/>
+          <w:numId w:val="1013"/>
+        </w:numPr>
+      </w:pPr>
+      <w:r>
+        <w:rPr>
+          <w:b/>
+          <w:bCs/>
+        </w:rPr>
+        <w:t xml:space="preserve">You can’t break anything permanently.</w:t>
+      </w:r>
+      <w:r>
+        <w:t xml:space="preserve"> </w:t>
+      </w:r>
+      <w:r>
+        <w:t xml:space="preserve">Sanity keeps a history, so if something</w:t>
+      </w:r>
+      <w:r>
+        <w:t xml:space="preserve"> </w:t>
+      </w:r>
+      <w:r>
+        <w:t xml:space="preserve">looks wrong, message Josh — earlier versions can be restored.</w:t>
+      </w:r>
+    </w:p>
+    <w:p>
+      <w:pPr>
+        <w:pStyle w:val="Compact"/>
+        <w:numPr>
+          <w:ilvl w:val="0"/>
+          <w:numId w:val="1013"/>
+        </w:numPr>
+      </w:pPr>
+      <w:r>
+        <w:rPr>
+          <w:b/>
+          <w:bCs/>
+        </w:rPr>
+        <w:t xml:space="preserve">Leave Frames, Categories, Pricing Rules, Print Type Descriptions, and Shipping</w:t>
+      </w:r>
+      <w:r>
+        <w:rPr>
+          <w:b/>
+          <w:bCs/>
+        </w:rPr>
+        <w:t xml:space="preserve"> </w:t>
+      </w:r>
+      <w:r>
+        <w:rPr>
+          <w:b/>
+          <w:bCs/>
+        </w:rPr>
+        <w:t xml:space="preserve">Rates alone</w:t>
+      </w:r>
+      <w:r>
+        <w:t xml:space="preserve"> </w:t>
+      </w:r>
+      <w:r>
+        <w:t xml:space="preserve">unless you’re working with Josh directly — these control the pricing</w:t>
+      </w:r>
+      <w:r>
+        <w:t xml:space="preserve"> </w:t>
+      </w:r>
+      <w:r>
+        <w:t xml:space="preserve">and shipping math behind the scenes, and a wrong number there can mis-price a print</w:t>
+      </w:r>
+      <w:r>
+        <w:t xml:space="preserve"> </w:t>
+      </w:r>
+      <w:r>
+        <w:t xml:space="preserve">storewide.</w:t>
+      </w:r>
+    </w:p>
     <w:bookmarkEnd w:id="19"/>
-    <w:bookmarkStart w:id="20" w:name="a-few-important-habits"/>
+    <w:bookmarkStart w:id="20" w:name="if-something-goes-wrong"/>
     <w:p>
       <w:pPr>
         <w:pStyle w:val="Heading2"/>
       </w:pPr>
       <w:r>
-        <w:t xml:space="preserve">A Few Important Habits</w:t>
-      </w:r>
-    </w:p>
-    <w:p>
-      <w:pPr>
-        <w:pStyle w:val="Compact"/>
-        <w:numPr>
-          <w:ilvl w:val="0"/>
-          <w:numId w:val="1013"/>
-        </w:numPr>
-      </w:pPr>
-      <w:r>
-        <w:rPr>
-          <w:b/>
-          <w:bCs/>
-        </w:rPr>
-        <w:t xml:space="preserve">Always click Publish.</w:t>
-      </w:r>
-      <w:r>
-        <w:t xml:space="preserve"> </w:t>
-      </w:r>
-      <w:r>
-        <w:t xml:space="preserve">Nothing goes live on the website until you do — Sanity</w:t>
-      </w:r>
-      <w:r>
-        <w:t xml:space="preserve"> </w:t>
-      </w:r>
-      <w:r>
-        <w:t xml:space="preserve">saves drafts automatically as you type, but a draft alone doesn't update the site.</w:t>
-      </w:r>
-    </w:p>
-    <w:p>
-      <w:pPr>
-        <w:pStyle w:val="Compact"/>
-        <w:numPr>
-          <w:ilvl w:val="0"/>
-          <w:numId w:val="1013"/>
-        </w:numPr>
-      </w:pPr>
-      <w:r>
-        <w:rPr>
-          <w:b/>
-          <w:bCs/>
-        </w:rPr>
-        <w:t xml:space="preserve">Give it a minute.</w:t>
-      </w:r>
-      <w:r>
-        <w:t xml:space="preserve"> </w:t>
-      </w:r>
-      <w:r>
-        <w:t xml:space="preserve">After publishing, the live site can take a minute or two to</w:t>
-      </w:r>
-      <w:r>
-        <w:t xml:space="preserve"> </w:t>
-      </w:r>
-      <w:r>
-        <w:t xml:space="preserve">show your change (it's not broken — it's just catching up).</w:t>
-      </w:r>
-    </w:p>
-    <w:p>
-      <w:pPr>
-        <w:pStyle w:val="Compact"/>
-        <w:numPr>
-          <w:ilvl w:val="0"/>
-          <w:numId w:val="1013"/>
-        </w:numPr>
-      </w:pPr>
-      <w:r>
-        <w:rPr>
-          <w:b/>
-          <w:bCs/>
-        </w:rPr>
-        <w:t xml:space="preserve">You can't break anything permanently.</w:t>
-      </w:r>
-      <w:r>
-        <w:t xml:space="preserve"> </w:t>
-      </w:r>
-      <w:r>
-        <w:t xml:space="preserve">Sanity keeps a history, so if something</w:t>
-      </w:r>
-      <w:r>
-        <w:t xml:space="preserve"> </w:t>
-      </w:r>
-      <w:r>
-        <w:t xml:space="preserve">looks wrong, message Josh — earlier versions can be restored.</w:t>
-      </w:r>
-    </w:p>
-    <w:p>
-      <w:pPr>
-        <w:pStyle w:val="Compact"/>
-        <w:numPr>
-          <w:ilvl w:val="0"/>
-          <w:numId w:val="1013"/>
-        </w:numPr>
-      </w:pPr>
-      <w:r>
-        <w:rPr>
-          <w:b/>
-          <w:bCs/>
-        </w:rPr>
-        <w:t xml:space="preserve">Leave Frames, Categories, Pricing Rules, Print Type Descriptions, and Shipping</w:t>
-      </w:r>
-      <w:r>
-        <w:rPr>
-          <w:b/>
-          <w:bCs/>
-        </w:rPr>
-        <w:t xml:space="preserve"> </w:t>
-      </w:r>
-      <w:r>
-        <w:rPr>
-          <w:b/>
-          <w:bCs/>
-        </w:rPr>
-        <w:t xml:space="preserve">Rates alone</w:t>
-      </w:r>
-      <w:r>
-        <w:t xml:space="preserve"> </w:t>
-      </w:r>
-      <w:r>
-        <w:t xml:space="preserve">unless you're working with Josh directly — these control the pricing</w:t>
-      </w:r>
-      <w:r>
-        <w:t xml:space="preserve"> </w:t>
-      </w:r>
-      <w:r>
-        <w:t xml:space="preserve">and shipping math behind the scenes, and a wrong number there can mis-price a print</w:t>
-      </w:r>
-      <w:r>
-        <w:t xml:space="preserve"> </w:t>
-      </w:r>
-      <w:r>
-        <w:t xml:space="preserve">storewide.</w:t>
+        <w:t xml:space="preserve">If Something Goes Wrong</w:t>
+      </w:r>
+    </w:p>
+    <w:p>
+      <w:pPr>
+        <w:pStyle w:val="FirstParagraph"/>
+      </w:pPr>
+      <w:r>
+        <w:t xml:space="preserve">Text or call Josh. Nothing you do in Studio can take the site down — worst case, we</w:t>
+      </w:r>
+      <w:r>
+        <w:t xml:space="preserve"> </w:t>
+      </w:r>
+      <w:r>
+        <w:t xml:space="preserve">just fix or undo the change together.</w:t>
+      </w:r>
+    </w:p>
+    <w:p>
+      <w:r>
+        <w:pict>
+          <v:rect style="width:0;height:1.5pt" o:hralign="center" o:hrstd="t" o:hr="t"/>
+        </w:pict>
       </w:r>
     </w:p>
     <w:bookmarkEnd w:id="20"/>
-    <w:bookmarkStart w:id="21" w:name="if-something-goes-wrong"/>
+    <w:bookmarkStart w:id="21" w:name="domain-names-reference"/>
     <w:p>
       <w:pPr>
         <w:pStyle w:val="Heading2"/>
       </w:pPr>
       <w:r>
-        <w:t xml:space="preserve">If Something Goes Wrong</w:t>
+        <w:t xml:space="preserve">Domain Names (Reference)</w:t>
       </w:r>
     </w:p>
     <w:p>
@@ -2378,17 +2449,154 @@
         <w:pStyle w:val="FirstParagraph"/>
       </w:pPr>
       <w:r>
-        <w:t xml:space="preserve">Text or call Josh. Nothing you do in Studio can take the site down — worst case, we</w:t>
-      </w:r>
-      <w:r>
-        <w:t xml:space="preserve"> </w:t>
-      </w:r>
-      <w:r>
-        <w:t xml:space="preserve">just fix or undo the change together.</w:t>
+        <w:t xml:space="preserve">The website answers to two domains:</w:t>
+      </w:r>
+    </w:p>
+    <w:p>
+      <w:pPr>
+        <w:pStyle w:val="Compact"/>
+        <w:numPr>
+          <w:ilvl w:val="0"/>
+          <w:numId w:val="1014"/>
+        </w:numPr>
+      </w:pPr>
+      <w:r>
+        <w:rPr>
+          <w:b/>
+          <w:bCs/>
+        </w:rPr>
+        <w:t xml:space="preserve">robertduncanfineart.com</w:t>
+      </w:r>
+      <w:r>
+        <w:t xml:space="preserve"> </w:t>
+      </w:r>
+      <w:r>
+        <w:t xml:space="preserve">— the main site address, registered/managed through</w:t>
+      </w:r>
+      <w:r>
+        <w:t xml:space="preserve"> </w:t>
+      </w:r>
+      <w:r>
+        <w:rPr>
+          <w:b/>
+          <w:bCs/>
+        </w:rPr>
+        <w:t xml:space="preserve">Squarespace Domains</w:t>
+      </w:r>
+      <w:r>
+        <w:t xml:space="preserve">.</w:t>
+      </w:r>
+    </w:p>
+    <w:p>
+      <w:pPr>
+        <w:pStyle w:val="Compact"/>
+        <w:numPr>
+          <w:ilvl w:val="0"/>
+          <w:numId w:val="1014"/>
+        </w:numPr>
+      </w:pPr>
+      <w:r>
+        <w:rPr>
+          <w:b/>
+          <w:bCs/>
+        </w:rPr>
+        <w:t xml:space="preserve">robertduncan.art</w:t>
+      </w:r>
+      <w:r>
+        <w:t xml:space="preserve"> </w:t>
+      </w:r>
+      <w:r>
+        <w:t xml:space="preserve">— a second domain, registered/managed through</w:t>
+      </w:r>
+      <w:r>
+        <w:t xml:space="preserve"> </w:t>
+      </w:r>
+      <w:r>
+        <w:rPr>
+          <w:b/>
+          <w:bCs/>
+        </w:rPr>
+        <w:t xml:space="preserve">GoDaddy</w:t>
+      </w:r>
+      <w:r>
+        <w:t xml:space="preserve">,</w:t>
+      </w:r>
+      <w:r>
+        <w:t xml:space="preserve"> </w:t>
+      </w:r>
+      <w:r>
+        <w:t xml:space="preserve">set up to forward visitors to robertduncanfineart.com.</w:t>
+      </w:r>
+    </w:p>
+    <w:p>
+      <w:pPr>
+        <w:pStyle w:val="FirstParagraph"/>
+      </w:pPr>
+      <w:r>
+        <w:t xml:space="preserve">You shouldn’t need to touch either of these day-to-day — this is just here so you</w:t>
+      </w:r>
+      <w:r>
+        <w:t xml:space="preserve"> </w:t>
+      </w:r>
+      <w:r>
+        <w:t xml:space="preserve">know where they live if a renewal notice shows up or something needs to change.</w:t>
       </w:r>
     </w:p>
     <w:bookmarkEnd w:id="21"/>
+    <w:bookmarkStart w:id="22" w:name="email-reference"/>
+    <w:p>
+      <w:pPr>
+        <w:pStyle w:val="Heading2"/>
+      </w:pPr>
+      <w:r>
+        <w:t xml:space="preserve">Email (Reference)</w:t>
+      </w:r>
+    </w:p>
+    <w:p>
+      <w:pPr>
+        <w:pStyle w:val="FirstParagraph"/>
+      </w:pPr>
+      <w:r>
+        <w:t xml:space="preserve">The site’s email addresses (4 total) are managed through</w:t>
+      </w:r>
+      <w:r>
+        <w:t xml:space="preserve"> </w:t>
+      </w:r>
+      <w:r>
+        <w:rPr>
+          <w:b/>
+          <w:bCs/>
+        </w:rPr>
+        <w:t xml:space="preserve">Google Workspace</w:t>
+      </w:r>
+      <w:r>
+        <w:t xml:space="preserve">, under</w:t>
+      </w:r>
+      <w:r>
+        <w:t xml:space="preserve"> </w:t>
+      </w:r>
+      <w:r>
+        <w:t xml:space="preserve">the</w:t>
+      </w:r>
+      <w:r>
+        <w:t xml:space="preserve"> </w:t>
+      </w:r>
+      <w:r>
+        <w:rPr>
+          <w:b/>
+          <w:bCs/>
+        </w:rPr>
+        <w:t xml:space="preserve">jduncan@robertduncanfineart.com</w:t>
+      </w:r>
+      <w:r>
+        <w:t xml:space="preserve"> </w:t>
+      </w:r>
+      <w:r>
+        <w:t xml:space="preserve">account.</w:t>
+      </w:r>
+    </w:p>
     <w:bookmarkEnd w:id="22"/>
+    <w:bookmarkEnd w:id="23"/>
     <w:sectPr>
       <w:footnotePr>
         <w:numRestart w:val="eachSect"/>
@@ -2970,6 +3178,9 @@
     </w:lvlOverride>
   </w:num>
   <w:num w:numId="1013">
+    <w:abstractNumId w:val="991"/>
+  </w:num>
+  <w:num w:numId="1014">
     <w:abstractNumId w:val="991"/>
   </w:num>
 </w:numbering>

</xml_diff>